<commit_message>
Updated user document and pdf for web download
</commit_message>
<xml_diff>
--- a/CPAP_Tool_Summary_August_26_2026.docx
+++ b/CPAP_Tool_Summary_August_26_2026.docx
@@ -19,6 +19,7 @@
           <w:rFonts w:ascii="Abadi" w:hAnsi="Abadi"/>
           <w:b/>
           <w:bCs/>
+          <w:noProof/>
           <w:color w:val="004167"/>
           <w:sz w:val="34"/>
           <w:szCs w:val="34"/>
@@ -114,7 +115,18 @@
           <w:sz w:val="34"/>
           <w:szCs w:val="34"/>
         </w:rPr>
-        <w:t xml:space="preserve"> _v1</w:t>
+        <w:t xml:space="preserve"> v1</w:t>
+      </w:r>
+      <w:r>
+        <w:rPr>
+          <w:rFonts w:ascii="Abadi" w:hAnsi="Abadi"/>
+          <w:b/>
+          <w:bCs/>
+          <w:color w:val="004167"/>
+          <w:sz w:val="34"/>
+          <w:szCs w:val="34"/>
+        </w:rPr>
+        <w:t>.1</w:t>
       </w:r>
     </w:p>
     <w:p>
@@ -151,124 +163,157 @@
           <w:sz w:val="19"/>
           <w:szCs w:val="19"/>
         </w:rPr>
-        <w:t xml:space="preserve">This tool estimates how many CPAP (Continuous Positive Airway Pressure) breathing-support devices a </w:t>
-      </w:r>
-      <w:r>
-        <w:rPr>
-          <w:rFonts w:ascii="Abadi" w:hAnsi="Abadi"/>
-          <w:color w:val="222222"/>
-          <w:sz w:val="19"/>
-          <w:szCs w:val="19"/>
-        </w:rPr>
-        <w:t xml:space="preserve">hospital </w:t>
-      </w:r>
-      <w:r>
-        <w:rPr>
-          <w:rFonts w:ascii="Abadi" w:hAnsi="Abadi"/>
-          <w:color w:val="222222"/>
-          <w:sz w:val="19"/>
-          <w:szCs w:val="19"/>
-        </w:rPr>
-        <w:t xml:space="preserve">newborn </w:t>
-      </w:r>
-      <w:r>
-        <w:rPr>
-          <w:rFonts w:ascii="Abadi" w:hAnsi="Abadi"/>
-          <w:color w:val="222222"/>
-          <w:sz w:val="19"/>
-          <w:szCs w:val="19"/>
-        </w:rPr>
-        <w:t xml:space="preserve">unit </w:t>
-      </w:r>
-      <w:r>
-        <w:rPr>
-          <w:rFonts w:ascii="Abadi" w:hAnsi="Abadi"/>
-          <w:color w:val="222222"/>
-          <w:sz w:val="19"/>
-          <w:szCs w:val="19"/>
-        </w:rPr>
-        <w:t>need</w:t>
-      </w:r>
-      <w:r>
-        <w:rPr>
-          <w:rFonts w:ascii="Abadi" w:hAnsi="Abadi"/>
-          <w:color w:val="222222"/>
-          <w:sz w:val="19"/>
-          <w:szCs w:val="19"/>
-        </w:rPr>
-        <w:t xml:space="preserve">. It takes two simple inputs </w:t>
-      </w:r>
-      <w:r>
-        <w:rPr>
-          <w:rFonts w:ascii="Abadi" w:hAnsi="Abadi"/>
-          <w:color w:val="222222"/>
-          <w:sz w:val="19"/>
-          <w:szCs w:val="19"/>
-        </w:rPr>
-        <w:t>-</w:t>
-      </w:r>
-      <w:r>
-        <w:rPr>
-          <w:rFonts w:ascii="Abadi" w:hAnsi="Abadi"/>
-          <w:color w:val="222222"/>
-          <w:sz w:val="19"/>
-          <w:szCs w:val="19"/>
-        </w:rPr>
-        <w:t xml:space="preserve"> average monthly admissions and the hospital's level of care </w:t>
-      </w:r>
-      <w:r>
-        <w:rPr>
-          <w:rFonts w:ascii="Abadi" w:hAnsi="Abadi"/>
-          <w:color w:val="222222"/>
-          <w:sz w:val="19"/>
-          <w:szCs w:val="19"/>
-        </w:rPr>
-        <w:t>-</w:t>
-      </w:r>
-      <w:r>
-        <w:rPr>
-          <w:rFonts w:ascii="Abadi" w:hAnsi="Abadi"/>
-          <w:color w:val="222222"/>
-          <w:sz w:val="19"/>
-          <w:szCs w:val="19"/>
-        </w:rPr>
-        <w:t xml:space="preserve"> and returns a device count with a 95% confidence range. It was built from patient-level records </w:t>
-      </w:r>
-      <w:r>
-        <w:rPr>
-          <w:rFonts w:ascii="Abadi" w:hAnsi="Abadi"/>
-          <w:color w:val="222222"/>
-          <w:sz w:val="19"/>
-          <w:szCs w:val="19"/>
-        </w:rPr>
-        <w:t xml:space="preserve">(2021-2026) </w:t>
-      </w:r>
-      <w:r>
-        <w:rPr>
-          <w:rFonts w:ascii="Abadi" w:hAnsi="Abadi"/>
-          <w:color w:val="222222"/>
-          <w:sz w:val="19"/>
-          <w:szCs w:val="19"/>
-        </w:rPr>
-        <w:t>across 105 hospitals in five African countries (Ethiopia, Kenya, Malawi, Nigeria, Tanzania)</w:t>
-      </w:r>
-      <w:r>
-        <w:rPr>
-          <w:rFonts w:ascii="Abadi" w:hAnsi="Abadi"/>
-          <w:color w:val="222222"/>
-          <w:sz w:val="19"/>
-          <w:szCs w:val="19"/>
-        </w:rPr>
-        <w:t xml:space="preserve"> implementing with NEST360 Alliance</w:t>
-      </w:r>
-      <w:r>
-        <w:rPr>
-          <w:rFonts w:ascii="Abadi" w:hAnsi="Abadi"/>
-          <w:color w:val="222222"/>
-          <w:sz w:val="19"/>
-          <w:szCs w:val="19"/>
-        </w:rPr>
-        <w:t>.</w:t>
+        <w:t>This tool estimates how many CPAP (Continuous Positive Airway Pressure) breathing-support devices a hospital newborn unit needs. It takes two simple inputs - average monthly admissions and the hospital's level of care - and returns a device count with a 95% confidence range. It was built from patient-level records (2021-2026) across 105 hospitals in five African countries (Ethiopia, Kenya, Malawi, Nigeria, Tanzania), in partnership with the NEST360 Alliance.</w:t>
+      </w:r>
+      <w:r>
+        <w:rPr>
+          <w:rFonts w:ascii="Abadi" w:hAnsi="Abadi"/>
+          <w:color w:val="222222"/>
+          <w:sz w:val="19"/>
+          <w:szCs w:val="19"/>
+        </w:rPr>
+      </w:r>
+      <w:r>
+        <w:rPr>
+          <w:rFonts w:ascii="Abadi" w:hAnsi="Abadi"/>
+          <w:color w:val="222222"/>
+          <w:sz w:val="19"/>
+          <w:szCs w:val="19"/>
+        </w:rPr>
+      </w:r>
+      <w:r>
+        <w:rPr>
+          <w:rFonts w:ascii="Abadi" w:hAnsi="Abadi"/>
+          <w:color w:val="222222"/>
+          <w:sz w:val="19"/>
+          <w:szCs w:val="19"/>
+        </w:rPr>
+      </w:r>
+      <w:r>
+        <w:rPr>
+          <w:rFonts w:ascii="Abadi" w:hAnsi="Abadi"/>
+          <w:color w:val="222222"/>
+          <w:sz w:val="19"/>
+          <w:szCs w:val="19"/>
+        </w:rPr>
+      </w:r>
+      <w:r>
+        <w:rPr>
+          <w:rFonts w:ascii="Abadi" w:hAnsi="Abadi"/>
+          <w:color w:val="222222"/>
+          <w:sz w:val="19"/>
+          <w:szCs w:val="19"/>
+        </w:rPr>
+      </w:r>
+      <w:r>
+        <w:rPr>
+          <w:rFonts w:ascii="Abadi" w:hAnsi="Abadi"/>
+          <w:color w:val="222222"/>
+          <w:sz w:val="19"/>
+          <w:szCs w:val="19"/>
+        </w:rPr>
+      </w:r>
+      <w:r>
+        <w:rPr>
+          <w:rFonts w:ascii="Abadi" w:hAnsi="Abadi"/>
+          <w:color w:val="222222"/>
+          <w:sz w:val="19"/>
+          <w:szCs w:val="19"/>
+        </w:rPr>
+      </w:r>
+      <w:r>
+        <w:rPr>
+          <w:rFonts w:ascii="Abadi" w:hAnsi="Abadi"/>
+          <w:color w:val="222222"/>
+          <w:sz w:val="19"/>
+          <w:szCs w:val="19"/>
+        </w:rPr>
+      </w:r>
+      <w:r>
+        <w:rPr>
+          <w:rFonts w:ascii="Abadi" w:hAnsi="Abadi"/>
+          <w:color w:val="222222"/>
+          <w:sz w:val="19"/>
+          <w:szCs w:val="19"/>
+        </w:rPr>
+      </w:r>
+      <w:r>
+        <w:rPr>
+          <w:rFonts w:ascii="Abadi" w:hAnsi="Abadi"/>
+          <w:color w:val="222222"/>
+          <w:sz w:val="19"/>
+          <w:szCs w:val="19"/>
+        </w:rPr>
+      </w:r>
+      <w:r>
+        <w:rPr>
+          <w:rFonts w:ascii="Abadi" w:hAnsi="Abadi"/>
+          <w:color w:val="222222"/>
+          <w:sz w:val="19"/>
+          <w:szCs w:val="19"/>
+        </w:rPr>
+      </w:r>
+      <w:r>
+        <w:rPr>
+          <w:rFonts w:ascii="Abadi" w:hAnsi="Abadi"/>
+          <w:color w:val="222222"/>
+          <w:sz w:val="19"/>
+          <w:szCs w:val="19"/>
+        </w:rPr>
+      </w:r>
+    </w:p>
+    <w:p>
+      <w:pPr>
+        <w:spacing w:before="120"/>
+        <w:rPr>
+          <w:rFonts w:ascii="Abadi" w:hAnsi="Abadi"/>
+          <w:i/>
+          <w:iCs/>
+          <w:color w:val="5B6470"/>
+          <w:sz w:val="18"/>
+          <w:szCs w:val="18"/>
+        </w:rPr>
+      </w:pPr>
+      <w:r>
+        <w:rPr>
+          <w:rFonts w:ascii="Abadi" w:hAnsi="Abadi"/>
+          <w:i/>
+          <w:iCs/>
+          <w:color w:val="5B6470"/>
+          <w:sz w:val="18"/>
+          <w:szCs w:val="18"/>
+        </w:rPr>
+        <w:t>Capacity to provide quality CPAP (staffing, infrastructure, oxygen supply, monitoring, etc.) must be assessed at each hospital before this estimate is used to inform procurement decisions.</w:t>
+      </w:r>
+      <w:r>
+        <w:rPr>
+          <w:rFonts w:ascii="Abadi" w:hAnsi="Abadi"/>
+          <w:i/>
+          <w:iCs/>
+          <w:color w:val="5B6470"/>
+          <w:sz w:val="18"/>
+          <w:szCs w:val="18"/>
+        </w:rPr>
+      </w:r>
+      <w:r>
+        <w:rPr>
+          <w:rFonts w:ascii="Abadi" w:hAnsi="Abadi"/>
+          <w:i/>
+          <w:iCs/>
+          <w:color w:val="5B6470"/>
+          <w:sz w:val="18"/>
+          <w:szCs w:val="18"/>
+        </w:rPr>
+      </w:r>
+      <w:r>
+        <w:rPr>
+          <w:rFonts w:ascii="Abadi" w:hAnsi="Abadi"/>
+          <w:i/>
+          <w:iCs/>
+          <w:color w:val="5B6470"/>
+          <w:sz w:val="18"/>
+          <w:szCs w:val="18"/>
+        </w:rPr>
       </w:r>
     </w:p>
     <w:p>
@@ -307,7 +352,27 @@
           <w:sz w:val="19"/>
           <w:szCs w:val="19"/>
         </w:rPr>
-        <w:t>Devices needed = (Admissions × Eligibility rate × Length of treatment / 30) × Surge factor × (1 + Maintenance buffer)</w:t>
+        <w:t>Base devices = ROUNDUP(Admissions × Eligibility rate × Length of treatment / 30 × Surge factor)</w:t>
+        <w:br/>
+      </w:r>
+      <w:r>
+        <w:rPr>
+          <w:rFonts w:ascii="Abadi" w:hAnsi="Abadi"/>
+          <w:i/>
+          <w:color w:val="222222"/>
+          <w:sz w:val="19"/>
+        </w:rPr>
+        <w:t>Maintenance buffer = 0 if Base devices = 0; otherwise at least 1, rounded up from Base devices × Maintenance rate</w:t>
+        <w:br/>
+      </w:r>
+      <w:r>
+        <w:rPr>
+          <w:rFonts w:ascii="Abadi" w:hAnsi="Abadi"/>
+          <w:i/>
+          <w:color w:val="222222"/>
+          <w:sz w:val="19"/>
+        </w:rPr>
+        <w:t>Devices needed = Base devices + Maintenance buffer</w:t>
       </w:r>
     </w:p>
     <w:p>
@@ -324,7 +389,7 @@
           <w:sz w:val="19"/>
           <w:szCs w:val="19"/>
         </w:rPr>
-        <w:t>In plain terms: how many babies need CPAP each month, multiplied by how long each one typically stays on a device, gives the average number of devices in use at once. We then add a margin for busier-than-average periods (surge) and for devices temporarily out of service for repair (maintenance).</w:t>
+        <w:t>In plain terms: how many babies need CPAP each month, multiplied by how long each one typically stays on a device, gives the average number of devices in use at once. We then add a margin for busier-than-average periods (surge), and separately add a maintenance buffer for devices temporarily out of service for repair - calculated on its own so it doesn't disappear to zero for smaller hospitals, as it would if folded into one combined rounding step.</w:t>
       </w:r>
     </w:p>
     <w:p>
@@ -406,7 +471,7 @@
           <w:sz w:val="19"/>
           <w:szCs w:val="19"/>
         </w:rPr>
-        <w:t>Length of treatment uses a statistical method (competing-risks analysis) that separates babies who died on CPAP from babies who recovered, so that early deaths do not distort the treatment-duration figure.</w:t>
+        <w:t>Length of treatment uses a competing-risks statistical method (Restricted Mean Time Lost, RMTL) that separates babies who died on CPAP from babies who recovered, so that early deaths do not distort the treatment-duration figure.</w:t>
       </w:r>
     </w:p>
     <w:p>
@@ -451,6 +516,28 @@
           <w:szCs w:val="19"/>
         </w:rPr>
         <w:t>Surge (2.0×) and maintenance buffer (3.4%) are fixed values, from expert judgment and equipment audit data respectively, applied the same way across all hospital levels.</w:t>
+      </w:r>
+    </w:p>
+    <w:p>
+      <w:pPr>
+        <w:pStyle w:val="ListParagraph"/>
+        <w:numPr>
+          <w:ilvl w:val="0"/>
+          <w:numId w:val="1"/>
+        </w:numPr>
+        <w:spacing w:after="60"/>
+        <w:rPr>
+          <w:rFonts w:ascii="Abadi" w:hAnsi="Abadi"/>
+        </w:rPr>
+      </w:pPr>
+      <w:r>
+        <w:rPr>
+          <w:rFonts w:ascii="Abadi" w:hAnsi="Abadi"/>
+          <w:color w:val="222222"/>
+          <w:sz w:val="19"/>
+          <w:szCs w:val="19"/>
+        </w:rPr>
+        <w:t>Devices needed are calculated in two rounded steps - demand and surge together, then a maintenance buffer rounded separately and always at least one device once there is real demand - so the buffer doesn't vanish for smaller hospitals, without the extra inflation that would come from rounding every step independently.</w:t>
       </w:r>
     </w:p>
     <w:p>
@@ -498,12 +585,6 @@
         <w:gridCol w:w="1450"/>
       </w:tblGrid>
       <w:tr>
-        <w:tblPrEx>
-          <w:tblCellMar>
-            <w:top w:w="0" w:type="dxa"/>
-            <w:bottom w:w="0" w:type="dxa"/>
-          </w:tblCellMar>
-        </w:tblPrEx>
         <w:tc>
           <w:tcPr>
             <w:tcW w:w="2800" w:type="dxa"/>
@@ -686,12 +767,6 @@
         </w:tc>
       </w:tr>
       <w:tr>
-        <w:tblPrEx>
-          <w:tblCellMar>
-            <w:top w:w="0" w:type="dxa"/>
-            <w:bottom w:w="0" w:type="dxa"/>
-          </w:tblCellMar>
-        </w:tblPrEx>
         <w:tc>
           <w:tcPr>
             <w:tcW w:w="2800" w:type="dxa"/>
@@ -859,12 +934,6 @@
         </w:tc>
       </w:tr>
       <w:tr>
-        <w:tblPrEx>
-          <w:tblCellMar>
-            <w:top w:w="0" w:type="dxa"/>
-            <w:bottom w:w="0" w:type="dxa"/>
-          </w:tblCellMar>
-        </w:tblPrEx>
         <w:tc>
           <w:tcPr>
             <w:tcW w:w="2800" w:type="dxa"/>
@@ -1032,12 +1101,6 @@
         </w:tc>
       </w:tr>
       <w:tr>
-        <w:tblPrEx>
-          <w:tblCellMar>
-            <w:top w:w="0" w:type="dxa"/>
-            <w:bottom w:w="0" w:type="dxa"/>
-          </w:tblCellMar>
-        </w:tblPrEx>
         <w:tc>
           <w:tcPr>
             <w:tcW w:w="2800" w:type="dxa"/>
@@ -1281,16 +1344,7 @@
           <w:sz w:val="19"/>
           <w:szCs w:val="19"/>
         </w:rPr>
-        <w:t xml:space="preserve"> hospital data</w:t>
-      </w:r>
-      <w:r>
-        <w:rPr>
-          <w:rFonts w:ascii="Abadi" w:hAnsi="Abadi"/>
-          <w:color w:val="222222"/>
-          <w:sz w:val="19"/>
-          <w:szCs w:val="19"/>
-        </w:rPr>
-        <w:t>.</w:t>
+        <w:t xml:space="preserve"> hospital data.</w:t>
       </w:r>
     </w:p>
     <w:p>
@@ -1410,16 +1464,7 @@
           <w:sz w:val="19"/>
           <w:szCs w:val="19"/>
         </w:rPr>
-        <w:t>Every estimate comes with a 95% confidence range, making the underlying uncertainty explicit</w:t>
-      </w:r>
-      <w:r>
-        <w:rPr>
-          <w:rFonts w:ascii="Abadi" w:hAnsi="Abadi"/>
-          <w:color w:val="222222"/>
-          <w:sz w:val="19"/>
-          <w:szCs w:val="19"/>
-        </w:rPr>
-        <w:t>.</w:t>
+        <w:t>Every estimate comes with a 95% confidence range, making the underlying uncertainty explicit.</w:t>
       </w:r>
     </w:p>
     <w:p>
@@ -1441,25 +1486,23 @@
           <w:sz w:val="19"/>
           <w:szCs w:val="19"/>
         </w:rPr>
-        <w:t xml:space="preserve">Aligned with WHO's newborn care level-of-care framework, so results are </w:t>
-      </w:r>
-      <w:r>
-        <w:rPr>
-          <w:rFonts w:ascii="Abadi" w:hAnsi="Abadi"/>
-          <w:color w:val="222222"/>
-          <w:sz w:val="19"/>
-          <w:szCs w:val="19"/>
-        </w:rPr>
-        <w:t>relatable across health systems in various settings</w:t>
-      </w:r>
-      <w:r>
-        <w:rPr>
-          <w:rFonts w:ascii="Abadi" w:hAnsi="Abadi"/>
-          <w:color w:val="222222"/>
-          <w:sz w:val="19"/>
-          <w:szCs w:val="19"/>
-        </w:rPr>
-        <w:t>.</w:t>
+        <w:t>Aligned with WHO's newborn care level-of-care framework (WHO, 2020), so results are relatable across health systems in various settings.</w:t>
+      </w:r>
+      <w:r>
+        <w:rPr>
+          <w:rFonts w:ascii="Abadi" w:hAnsi="Abadi"/>
+          <w:color w:val="222222"/>
+          <w:sz w:val="19"/>
+          <w:szCs w:val="19"/>
+        </w:rPr>
+      </w:r>
+      <w:r>
+        <w:rPr>
+          <w:rFonts w:ascii="Abadi" w:hAnsi="Abadi"/>
+          <w:color w:val="222222"/>
+          <w:sz w:val="19"/>
+          <w:szCs w:val="19"/>
+        </w:rPr>
       </w:r>
     </w:p>
     <w:p>
@@ -1680,7 +1723,51 @@
           <w:sz w:val="19"/>
           <w:szCs w:val="19"/>
         </w:rPr>
-        <w:t>This tool has not yet been validated against independently measured device counts or usage in real hospitals; it should not be used as the sole basis for procurement decisions.</w:t>
+        <w:t>This tool has not yet been validated against independently measured device counts or usage in real hospitals.</w:t>
+      </w:r>
+    </w:p>
+    <w:p>
+      <w:pPr>
+        <w:pStyle w:val="ListParagraph"/>
+        <w:numPr>
+          <w:ilvl w:val="0"/>
+          <w:numId w:val="1"/>
+        </w:numPr>
+        <w:spacing w:after="60"/>
+        <w:rPr>
+          <w:rFonts w:ascii="Abadi" w:hAnsi="Abadi"/>
+        </w:rPr>
+      </w:pPr>
+      <w:r>
+        <w:rPr>
+          <w:rFonts w:ascii="Abadi" w:hAnsi="Abadi"/>
+          <w:color w:val="222222"/>
+          <w:sz w:val="19"/>
+          <w:szCs w:val="19"/>
+        </w:rPr>
+        <w:t>Level-of-care labels follow the WHO classification framework for consistency across countries; actual on-the-ground capacity at a given hospital may differ and should be verified directly, not assumed from the label alone.</w:t>
+      </w:r>
+    </w:p>
+    <w:p>
+      <w:pPr>
+        <w:pStyle w:val="ListParagraph"/>
+        <w:numPr>
+          <w:ilvl w:val="0"/>
+          <w:numId w:val="1"/>
+        </w:numPr>
+        <w:spacing w:after="60"/>
+        <w:rPr>
+          <w:rFonts w:ascii="Abadi" w:hAnsi="Abadi"/>
+        </w:rPr>
+      </w:pPr>
+      <w:r>
+        <w:rPr>
+          <w:rFonts w:ascii="Abadi" w:hAnsi="Abadi"/>
+          <w:color w:val="222222"/>
+          <w:sz w:val="19"/>
+          <w:szCs w:val="19"/>
+        </w:rPr>
+        <w:t>Device cleaning, disinfection, and preparation time between patients is not yet factored into these estimates, and would increase the effective number of devices needed beyond what is shown here.</w:t>
       </w:r>
     </w:p>
     <w:p>
@@ -1741,25 +1828,23 @@
           <w:sz w:val="19"/>
           <w:szCs w:val="19"/>
         </w:rPr>
-        <w:t>The tool is available as a simple</w:t>
-      </w:r>
-      <w:r>
-        <w:rPr>
-          <w:rFonts w:ascii="Abadi" w:hAnsi="Abadi"/>
-          <w:color w:val="222222"/>
-          <w:sz w:val="19"/>
-          <w:szCs w:val="19"/>
-        </w:rPr>
-        <w:t xml:space="preserve"> </w:t>
-      </w:r>
-      <w:r>
-        <w:rPr>
-          <w:rFonts w:ascii="Abadi" w:hAnsi="Abadi"/>
-          <w:color w:val="222222"/>
-          <w:sz w:val="19"/>
-          <w:szCs w:val="19"/>
-        </w:rPr>
-        <w:t xml:space="preserve">web calculator: a user enters monthly admissions and selects a hospital level, and receives a device estimate with its confidence range and a breakdown of the calculation. </w:t>
+        <w:t>The tool is available as a simple, free web calculator, part of NEST360's Device Quantity Estimation Tools initiative: a user enters monthly admissions and selects a hospital level, and receives a device estimate with its confidence range and a breakdown of the calculation. This document is also available as a downloadable PDF directly from the tool page.</w:t>
+      </w:r>
+      <w:r>
+        <w:rPr>
+          <w:rFonts w:ascii="Abadi" w:hAnsi="Abadi"/>
+          <w:color w:val="222222"/>
+          <w:sz w:val="19"/>
+          <w:szCs w:val="19"/>
+        </w:rPr>
+      </w:r>
+      <w:r>
+        <w:rPr>
+          <w:rFonts w:ascii="Abadi" w:hAnsi="Abadi"/>
+          <w:color w:val="222222"/>
+          <w:sz w:val="19"/>
+          <w:szCs w:val="19"/>
+        </w:rPr>
       </w:r>
     </w:p>
     <w:p>
@@ -1786,7 +1871,7 @@
             <w:sz w:val="19"/>
             <w:szCs w:val="19"/>
           </w:rPr>
-          <w:t>https://cpapcalculator.zahara.workers.dev/</w:t>
+          <w:t>https://cpap-calculator.zahara-quantum.com/cpap.html</w:t>
         </w:r>
       </w:hyperlink>
       <w:r>
@@ -1907,16 +1992,29 @@
           <w:sz w:val="19"/>
           <w:szCs w:val="19"/>
         </w:rPr>
-        <w:t>Planned: extending the same approach</w:t>
-      </w:r>
-      <w:r>
-        <w:rPr>
-          <w:rFonts w:ascii="Abadi" w:hAnsi="Abadi"/>
-          <w:color w:val="222222"/>
-          <w:sz w:val="19"/>
-          <w:szCs w:val="19"/>
-        </w:rPr>
-        <w:t xml:space="preserve"> to other neonatal equipment beyond CPAP.</w:t>
+        <w:t>Planned: extending the same approach to other neonatal equipment beyond CPAP.</w:t>
+      </w:r>
+    </w:p>
+    <w:p>
+      <w:pPr>
+        <w:pStyle w:val="ListParagraph"/>
+        <w:numPr>
+          <w:ilvl w:val="0"/>
+          <w:numId w:val="1"/>
+        </w:numPr>
+        <w:spacing w:after="60"/>
+        <w:rPr>
+          <w:rFonts w:ascii="Abadi" w:hAnsi="Abadi"/>
+        </w:rPr>
+      </w:pPr>
+      <w:r>
+        <w:rPr>
+          <w:rFonts w:ascii="Abadi" w:hAnsi="Abadi"/>
+          <w:color w:val="222222"/>
+          <w:sz w:val="19"/>
+          <w:szCs w:val="19"/>
+        </w:rPr>
+        <w:t>Under discussion: methods for rolling up hospital-level estimates into a national device-need total.</w:t>
       </w:r>
     </w:p>
     <w:p>
@@ -2062,6 +2160,37 @@
           <w:color w:val="5B6470"/>
           <w:sz w:val="18"/>
           <w:szCs w:val="18"/>
+        </w:rPr>
+        <w:t>)</w:t>
+      </w:r>
+      <w:r>
+        <w:rPr>
+          <w:rFonts w:ascii="Abadi" w:hAnsi="Abadi"/>
+          <w:i/>
+          <w:color w:val="5B6470"/>
+          <w:sz w:val="18"/>
+        </w:rPr>
+        <w:t xml:space="preserve"> or the NEST360 Alliance (</w:t>
+      </w:r>
+      <w:hyperlink r:id="rId14" w:history="1">
+        <w:r>
+          <w:rPr>
+            <w:rStyle w:val="Hyperlink"/>
+            <w:rFonts w:ascii="Abadi" w:hAnsi="Abadi"/>
+            <w:i/>
+            <w:iCs/>
+            <w:sz w:val="18"/>
+            <w:szCs w:val="18"/>
+          </w:rPr>
+          <w:t>info@nest360.org</w:t>
+        </w:r>
+      </w:hyperlink>
+      <w:r>
+        <w:rPr>
+          <w:rFonts w:ascii="Abadi" w:hAnsi="Abadi"/>
+          <w:i/>
+          <w:color w:val="5B6470"/>
+          <w:sz w:val="18"/>
         </w:rPr>
         <w:t>)</w:t>
       </w:r>
@@ -2745,6 +2874,7 @@
   <w:style w:type="character" w:default="1" w:styleId="DefaultParagraphFont">
     <w:name w:val="Default Paragraph Font"/>
     <w:uiPriority w:val="1"/>
+    <w:semiHidden/>
     <w:unhideWhenUsed/>
   </w:style>
   <w:style w:type="table" w:default="1" w:styleId="TableNormal">
@@ -2905,6 +3035,18 @@
     <w:link w:val="Footer"/>
     <w:uiPriority w:val="99"/>
     <w:rsid w:val="0074633C"/>
+  </w:style>
+  <w:style w:type="character" w:styleId="FollowedHyperlink">
+    <w:name w:val="FollowedHyperlink"/>
+    <w:basedOn w:val="DefaultParagraphFont"/>
+    <w:uiPriority w:val="99"/>
+    <w:semiHidden/>
+    <w:unhideWhenUsed/>
+    <w:rsid w:val="00CA5CAD"/>
+    <w:rPr>
+      <w:color w:val="96607D" w:themeColor="followedHyperlink"/>
+      <w:u w:val="single"/>
+    </w:rPr>
   </w:style>
 </w:styles>
 </file>

</xml_diff>